<commit_message>
Complete Project 15.1 Books Web Application
</commit_message>
<xml_diff>
--- a/Assignment/Project_15_1_Books_Web_Application/equired Project 15.1_Creating a Books Web Application.docx
+++ b/Assignment/Project_15_1_Books_Web_Application/equired Project 15.1_Creating a Books Web Application.docx
@@ -123,6 +123,61 @@
         <w:pStyle w:val="ListParagraph"/>
         <w:ind w:left="360"/>
       </w:pPr>
+      <w:r>
+        <w:t>F</w:t>
+      </w:r>
+      <w:r>
+        <w:t>lask-JWT-Extended install</w:t>
+      </w:r>
+    </w:p>
+    <w:p>
+      <w:pPr>
+        <w:pStyle w:val="ListParagraph"/>
+        <w:ind w:left="360"/>
+      </w:pPr>
+      <w:r>
+        <w:drawing>
+          <wp:inline distT="0" distB="0" distL="0" distR="0" wp14:anchorId="6CB2D7D8" wp14:editId="1CEB6CA9">
+            <wp:extent cx="5943600" cy="1294765"/>
+            <wp:effectExtent l="0" t="0" r="0" b="635"/>
+            <wp:docPr id="1201125716" name="Picture 1"/>
+            <wp:cNvGraphicFramePr>
+              <a:graphicFrameLocks xmlns:a="http://schemas.openxmlformats.org/drawingml/2006/main" noChangeAspect="1"/>
+            </wp:cNvGraphicFramePr>
+            <a:graphic xmlns:a="http://schemas.openxmlformats.org/drawingml/2006/main">
+              <a:graphicData uri="http://schemas.openxmlformats.org/drawingml/2006/picture">
+                <pic:pic xmlns:pic="http://schemas.openxmlformats.org/drawingml/2006/picture">
+                  <pic:nvPicPr>
+                    <pic:cNvPr id="1201125716" name=""/>
+                    <pic:cNvPicPr/>
+                  </pic:nvPicPr>
+                  <pic:blipFill>
+                    <a:blip r:embed="rId6"/>
+                    <a:stretch>
+                      <a:fillRect/>
+                    </a:stretch>
+                  </pic:blipFill>
+                  <pic:spPr>
+                    <a:xfrm>
+                      <a:off x="0" y="0"/>
+                      <a:ext cx="5943600" cy="1294765"/>
+                    </a:xfrm>
+                    <a:prstGeom prst="rect">
+                      <a:avLst/>
+                    </a:prstGeom>
+                  </pic:spPr>
+                </pic:pic>
+              </a:graphicData>
+            </a:graphic>
+          </wp:inline>
+        </w:drawing>
+      </w:r>
+    </w:p>
+    <w:p>
+      <w:pPr>
+        <w:pStyle w:val="ListParagraph"/>
+        <w:ind w:left="360"/>
+      </w:pPr>
     </w:p>
     <w:p>
       <w:pPr>
@@ -140,6 +195,73 @@
     <w:p>
       <w:pPr>
         <w:pStyle w:val="ListParagraph"/>
+        <w:ind w:left="360"/>
+      </w:pPr>
+    </w:p>
+    <w:p>
+      <w:pPr>
+        <w:pStyle w:val="ListParagraph"/>
+        <w:ind w:left="360"/>
+      </w:pPr>
+      <w:r>
+        <w:lastRenderedPageBreak/>
+        <w:t xml:space="preserve">Successfully extracted the starter files and </w:t>
+      </w:r>
+      <w:proofErr w:type="gramStart"/>
+      <w:r>
+        <w:t>saved</w:t>
+      </w:r>
+      <w:proofErr w:type="gramEnd"/>
+      <w:r>
+        <w:t xml:space="preserve"> in our module 15 project directory.</w:t>
+      </w:r>
+      <w:r>
+        <w:drawing>
+          <wp:inline distT="0" distB="0" distL="0" distR="0" wp14:anchorId="72A6495C" wp14:editId="44DB4AE9">
+            <wp:extent cx="5943600" cy="4519930"/>
+            <wp:effectExtent l="0" t="0" r="0" b="0"/>
+            <wp:docPr id="1689750082" name="Picture 1"/>
+            <wp:cNvGraphicFramePr>
+              <a:graphicFrameLocks xmlns:a="http://schemas.openxmlformats.org/drawingml/2006/main" noChangeAspect="1"/>
+            </wp:cNvGraphicFramePr>
+            <a:graphic xmlns:a="http://schemas.openxmlformats.org/drawingml/2006/main">
+              <a:graphicData uri="http://schemas.openxmlformats.org/drawingml/2006/picture">
+                <pic:pic xmlns:pic="http://schemas.openxmlformats.org/drawingml/2006/picture">
+                  <pic:nvPicPr>
+                    <pic:cNvPr id="1689750082" name=""/>
+                    <pic:cNvPicPr/>
+                  </pic:nvPicPr>
+                  <pic:blipFill>
+                    <a:blip r:embed="rId7"/>
+                    <a:stretch>
+                      <a:fillRect/>
+                    </a:stretch>
+                  </pic:blipFill>
+                  <pic:spPr>
+                    <a:xfrm>
+                      <a:off x="0" y="0"/>
+                      <a:ext cx="5943600" cy="4519930"/>
+                    </a:xfrm>
+                    <a:prstGeom prst="rect">
+                      <a:avLst/>
+                    </a:prstGeom>
+                  </pic:spPr>
+                </pic:pic>
+              </a:graphicData>
+            </a:graphic>
+          </wp:inline>
+        </w:drawing>
+      </w:r>
+    </w:p>
+    <w:p>
+      <w:pPr>
+        <w:pStyle w:val="ListParagraph"/>
+        <w:ind w:left="360"/>
+      </w:pPr>
+    </w:p>
+    <w:p>
+      <w:pPr>
+        <w:pStyle w:val="ListParagraph"/>
         <w:numPr>
           <w:ilvl w:val="0"/>
           <w:numId w:val="1"/>
@@ -155,13 +277,77 @@
         <w:pStyle w:val="ListParagraph"/>
         <w:numPr>
           <w:ilvl w:val="0"/>
-          <w:numId w:val="1"/>
+          <w:numId w:val="2"/>
         </w:numPr>
-        <w:ind w:left="360"/>
-      </w:pPr>
-      <w:r>
-        <w:t>Provide two screenshots, one for each new cover image, to show that you successfully uploaded and opened the new cover images in the static folder using VS Code.</w:t>
-      </w:r>
+        <w:spacing w:after="0" w:line="300" w:lineRule="atLeast"/>
+        <w:rPr>
+          <w:rFonts w:ascii="Segoe UI" w:eastAsia="Times New Roman" w:hAnsi="Segoe UI" w:cs="Segoe UI"/>
+          <w:kern w:val="0"/>
+          <w:sz w:val="21"/>
+          <w:szCs w:val="21"/>
+          <w14:ligatures w14:val="none"/>
+        </w:rPr>
+      </w:pPr>
+      <w:r>
+        <w:rPr>
+          <w:rFonts w:ascii="Segoe UI" w:eastAsia="Times New Roman" w:hAnsi="Segoe UI" w:cs="Segoe UI"/>
+          <w:kern w:val="0"/>
+          <w:sz w:val="21"/>
+          <w:szCs w:val="21"/>
+          <w14:ligatures w14:val="none"/>
+        </w:rPr>
+        <w:t>Two books added</w:t>
+      </w:r>
+    </w:p>
+    <w:p>
+      <w:pPr>
+        <w:pStyle w:val="ListParagraph"/>
+        <w:ind w:left="360"/>
+      </w:pPr>
+      <w:r>
+        <w:lastRenderedPageBreak/>
+        <w:drawing>
+          <wp:inline distT="0" distB="0" distL="0" distR="0" wp14:anchorId="544A6032" wp14:editId="410D92E9">
+            <wp:extent cx="5943600" cy="5293360"/>
+            <wp:effectExtent l="0" t="0" r="0" b="2540"/>
+            <wp:docPr id="1119827840" name="Picture 1"/>
+            <wp:cNvGraphicFramePr>
+              <a:graphicFrameLocks xmlns:a="http://schemas.openxmlformats.org/drawingml/2006/main" noChangeAspect="1"/>
+            </wp:cNvGraphicFramePr>
+            <a:graphic xmlns:a="http://schemas.openxmlformats.org/drawingml/2006/main">
+              <a:graphicData uri="http://schemas.openxmlformats.org/drawingml/2006/picture">
+                <pic:pic xmlns:pic="http://schemas.openxmlformats.org/drawingml/2006/picture">
+                  <pic:nvPicPr>
+                    <pic:cNvPr id="1119827840" name=""/>
+                    <pic:cNvPicPr/>
+                  </pic:nvPicPr>
+                  <pic:blipFill>
+                    <a:blip r:embed="rId8"/>
+                    <a:stretch>
+                      <a:fillRect/>
+                    </a:stretch>
+                  </pic:blipFill>
+                  <pic:spPr>
+                    <a:xfrm>
+                      <a:off x="0" y="0"/>
+                      <a:ext cx="5943600" cy="5293360"/>
+                    </a:xfrm>
+                    <a:prstGeom prst="rect">
+                      <a:avLst/>
+                    </a:prstGeom>
+                  </pic:spPr>
+                </pic:pic>
+              </a:graphicData>
+            </a:graphic>
+          </wp:inline>
+        </w:drawing>
+      </w:r>
+    </w:p>
+    <w:p>
+      <w:pPr>
+        <w:pStyle w:val="ListParagraph"/>
+        <w:ind w:left="360"/>
+      </w:pPr>
     </w:p>
     <w:p>
       <w:pPr>
@@ -173,21 +359,131 @@
         <w:ind w:left="360"/>
       </w:pPr>
       <w:r>
-        <w:t xml:space="preserve">Provide a screenshot to show that you successfully added the correct html line of code in </w:t>
-      </w:r>
-      <w:proofErr w:type="gramStart"/>
-      <w:r>
-        <w:t xml:space="preserve">the </w:t>
-      </w:r>
-      <w:proofErr w:type="spellStart"/>
-      <w:r>
-        <w:t>the</w:t>
-      </w:r>
-      <w:proofErr w:type="spellEnd"/>
-      <w:proofErr w:type="gramEnd"/>
-      <w:r>
-        <w:t xml:space="preserve"> books.html file.</w:t>
-      </w:r>
+        <w:t>Provide two screenshots, one for each new cover image, to show that you successfully uploaded and opened the new cover images in the static folder using VS Code.</w:t>
+      </w:r>
+    </w:p>
+    <w:p>
+      <w:pPr>
+        <w:pStyle w:val="ListParagraph"/>
+        <w:ind w:left="360"/>
+      </w:pPr>
+      <w:r>
+        <w:lastRenderedPageBreak/>
+        <w:t xml:space="preserve">4a - </w:t>
+      </w:r>
+      <w:r>
+        <w:t>image4.png open in VS Code</w:t>
+      </w:r>
+      <w:r>
+        <w:t xml:space="preserve"> </w:t>
+      </w:r>
+      <w:r>
+        <w:drawing>
+          <wp:inline distT="0" distB="0" distL="0" distR="0" wp14:anchorId="0AC8D165" wp14:editId="416C5FE1">
+            <wp:extent cx="5943600" cy="3583305"/>
+            <wp:effectExtent l="0" t="0" r="0" b="0"/>
+            <wp:docPr id="7367572" name="Picture 1"/>
+            <wp:cNvGraphicFramePr>
+              <a:graphicFrameLocks xmlns:a="http://schemas.openxmlformats.org/drawingml/2006/main" noChangeAspect="1"/>
+            </wp:cNvGraphicFramePr>
+            <a:graphic xmlns:a="http://schemas.openxmlformats.org/drawingml/2006/main">
+              <a:graphicData uri="http://schemas.openxmlformats.org/drawingml/2006/picture">
+                <pic:pic xmlns:pic="http://schemas.openxmlformats.org/drawingml/2006/picture">
+                  <pic:nvPicPr>
+                    <pic:cNvPr id="7367572" name=""/>
+                    <pic:cNvPicPr/>
+                  </pic:nvPicPr>
+                  <pic:blipFill>
+                    <a:blip r:embed="rId9"/>
+                    <a:stretch>
+                      <a:fillRect/>
+                    </a:stretch>
+                  </pic:blipFill>
+                  <pic:spPr>
+                    <a:xfrm>
+                      <a:off x="0" y="0"/>
+                      <a:ext cx="5943600" cy="3583305"/>
+                    </a:xfrm>
+                    <a:prstGeom prst="rect">
+                      <a:avLst/>
+                    </a:prstGeom>
+                  </pic:spPr>
+                </pic:pic>
+              </a:graphicData>
+            </a:graphic>
+          </wp:inline>
+        </w:drawing>
+      </w:r>
+    </w:p>
+    <w:p>
+      <w:pPr>
+        <w:pStyle w:val="ListParagraph"/>
+        <w:ind w:left="360"/>
+      </w:pPr>
+    </w:p>
+    <w:p>
+      <w:pPr>
+        <w:pStyle w:val="ListParagraph"/>
+        <w:ind w:left="360"/>
+      </w:pPr>
+      <w:r>
+        <w:t>4B</w:t>
+      </w:r>
+      <w:r>
+        <w:t xml:space="preserve"> - </w:t>
+      </w:r>
+      <w:r>
+        <w:t>image5.png open in VS Code</w:t>
+      </w:r>
+    </w:p>
+    <w:p>
+      <w:pPr>
+        <w:pStyle w:val="ListParagraph"/>
+        <w:ind w:left="360"/>
+      </w:pPr>
+      <w:r>
+        <w:drawing>
+          <wp:inline distT="0" distB="0" distL="0" distR="0" wp14:anchorId="176EAA70" wp14:editId="58EFFE33">
+            <wp:extent cx="5943600" cy="3410585"/>
+            <wp:effectExtent l="0" t="0" r="0" b="0"/>
+            <wp:docPr id="2112762381" name="Picture 1"/>
+            <wp:cNvGraphicFramePr>
+              <a:graphicFrameLocks xmlns:a="http://schemas.openxmlformats.org/drawingml/2006/main" noChangeAspect="1"/>
+            </wp:cNvGraphicFramePr>
+            <a:graphic xmlns:a="http://schemas.openxmlformats.org/drawingml/2006/main">
+              <a:graphicData uri="http://schemas.openxmlformats.org/drawingml/2006/picture">
+                <pic:pic xmlns:pic="http://schemas.openxmlformats.org/drawingml/2006/picture">
+                  <pic:nvPicPr>
+                    <pic:cNvPr id="2112762381" name=""/>
+                    <pic:cNvPicPr/>
+                  </pic:nvPicPr>
+                  <pic:blipFill>
+                    <a:blip r:embed="rId10"/>
+                    <a:stretch>
+                      <a:fillRect/>
+                    </a:stretch>
+                  </pic:blipFill>
+                  <pic:spPr>
+                    <a:xfrm>
+                      <a:off x="0" y="0"/>
+                      <a:ext cx="5943600" cy="3410585"/>
+                    </a:xfrm>
+                    <a:prstGeom prst="rect">
+                      <a:avLst/>
+                    </a:prstGeom>
+                  </pic:spPr>
+                </pic:pic>
+              </a:graphicData>
+            </a:graphic>
+          </wp:inline>
+        </w:drawing>
+      </w:r>
+    </w:p>
+    <w:p>
+      <w:pPr>
+        <w:pStyle w:val="ListParagraph"/>
+        <w:ind w:left="360"/>
+      </w:pPr>
     </w:p>
     <w:p>
       <w:pPr>
@@ -199,8 +495,108 @@
         <w:ind w:left="360"/>
       </w:pPr>
       <w:r>
-        <w:t>Provide a screenshot to show that you successfully added two new users, one with the role of admin and one with the role of reader, in the app.py file.</w:t>
-      </w:r>
+        <w:t xml:space="preserve">Provide a screenshot to show that you successfully added the correct html line of code in </w:t>
+      </w:r>
+      <w:proofErr w:type="gramStart"/>
+      <w:r>
+        <w:t xml:space="preserve">the </w:t>
+      </w:r>
+      <w:proofErr w:type="spellStart"/>
+      <w:r>
+        <w:t>the</w:t>
+      </w:r>
+      <w:proofErr w:type="spellEnd"/>
+      <w:proofErr w:type="gramEnd"/>
+      <w:r>
+        <w:t xml:space="preserve"> books.html file.</w:t>
+      </w:r>
+    </w:p>
+    <w:p>
+      <w:pPr>
+        <w:pStyle w:val="ListParagraph"/>
+        <w:numPr>
+          <w:ilvl w:val="0"/>
+          <w:numId w:val="2"/>
+        </w:numPr>
+        <w:spacing w:after="0" w:line="300" w:lineRule="atLeast"/>
+        <w:rPr>
+          <w:rFonts w:ascii="Segoe UI" w:eastAsia="Times New Roman" w:hAnsi="Segoe UI" w:cs="Segoe UI"/>
+          <w:kern w:val="0"/>
+          <w:sz w:val="21"/>
+          <w:szCs w:val="21"/>
+          <w14:ligatures w14:val="none"/>
+        </w:rPr>
+      </w:pPr>
+      <w:r>
+        <w:rPr>
+          <w:rFonts w:ascii="Courier New" w:eastAsia="Times New Roman" w:hAnsi="Courier New" w:cs="Courier New"/>
+          <w:kern w:val="0"/>
+          <w:sz w:val="20"/>
+          <w:szCs w:val="20"/>
+          <w14:ligatures w14:val="none"/>
+        </w:rPr>
+        <w:lastRenderedPageBreak/>
+        <w:t>books.html</w:t>
+      </w:r>
+      <w:r>
+        <w:rPr>
+          <w:rFonts w:ascii="Segoe UI" w:eastAsia="Times New Roman" w:hAnsi="Segoe UI" w:cs="Segoe UI"/>
+          <w:kern w:val="0"/>
+          <w:sz w:val="21"/>
+          <w:szCs w:val="21"/>
+          <w14:ligatures w14:val="none"/>
+        </w:rPr>
+        <w:t xml:space="preserve"> updated</w:t>
+      </w:r>
+    </w:p>
+    <w:p>
+      <w:pPr>
+        <w:pStyle w:val="ListParagraph"/>
+        <w:ind w:left="360"/>
+      </w:pPr>
+      <w:r>
+        <w:drawing>
+          <wp:inline distT="0" distB="0" distL="0" distR="0" wp14:anchorId="2E895113" wp14:editId="2AAE48DC">
+            <wp:extent cx="5943600" cy="4013200"/>
+            <wp:effectExtent l="0" t="0" r="0" b="6350"/>
+            <wp:docPr id="2083008783" name="Picture 1"/>
+            <wp:cNvGraphicFramePr>
+              <a:graphicFrameLocks xmlns:a="http://schemas.openxmlformats.org/drawingml/2006/main" noChangeAspect="1"/>
+            </wp:cNvGraphicFramePr>
+            <a:graphic xmlns:a="http://schemas.openxmlformats.org/drawingml/2006/main">
+              <a:graphicData uri="http://schemas.openxmlformats.org/drawingml/2006/picture">
+                <pic:pic xmlns:pic="http://schemas.openxmlformats.org/drawingml/2006/picture">
+                  <pic:nvPicPr>
+                    <pic:cNvPr id="2083008783" name=""/>
+                    <pic:cNvPicPr/>
+                  </pic:nvPicPr>
+                  <pic:blipFill>
+                    <a:blip r:embed="rId11"/>
+                    <a:stretch>
+                      <a:fillRect/>
+                    </a:stretch>
+                  </pic:blipFill>
+                  <pic:spPr>
+                    <a:xfrm>
+                      <a:off x="0" y="0"/>
+                      <a:ext cx="5943600" cy="4013200"/>
+                    </a:xfrm>
+                    <a:prstGeom prst="rect">
+                      <a:avLst/>
+                    </a:prstGeom>
+                  </pic:spPr>
+                </pic:pic>
+              </a:graphicData>
+            </a:graphic>
+          </wp:inline>
+        </w:drawing>
+      </w:r>
+    </w:p>
+    <w:p>
+      <w:pPr>
+        <w:pStyle w:val="ListParagraph"/>
+        <w:ind w:left="360"/>
+      </w:pPr>
     </w:p>
     <w:p>
       <w:pPr>
@@ -212,24 +608,75 @@
         <w:ind w:left="360"/>
       </w:pPr>
       <w:r>
-        <w:t xml:space="preserve">Provide a screenshot to show that you correctly defined the </w:t>
-      </w:r>
-      <w:proofErr w:type="spellStart"/>
-      <w:r>
-        <w:t>admin_required</w:t>
-      </w:r>
-      <w:proofErr w:type="spellEnd"/>
-      <w:r>
-        <w:t>(</w:t>
-      </w:r>
-      <w:proofErr w:type="spellStart"/>
-      <w:r>
-        <w:t>fn</w:t>
-      </w:r>
-      <w:proofErr w:type="spellEnd"/>
-      <w:r>
-        <w:t>) function.</w:t>
-      </w:r>
+        <w:t>Provide a screenshot to show that you successfully added two new users, one with the role of admin and one with the role of reader, in the app.py file.</w:t>
+      </w:r>
+    </w:p>
+    <w:p>
+      <w:pPr>
+        <w:pStyle w:val="ListParagraph"/>
+        <w:ind w:left="360"/>
+      </w:pPr>
+    </w:p>
+    <w:p>
+      <w:pPr>
+        <w:pStyle w:val="ListParagraph"/>
+        <w:numPr>
+          <w:ilvl w:val="0"/>
+          <w:numId w:val="2"/>
+        </w:numPr>
+      </w:pPr>
+      <w:r>
+        <w:t>Users added</w:t>
+      </w:r>
+    </w:p>
+    <w:p>
+      <w:pPr>
+        <w:pStyle w:val="ListParagraph"/>
+        <w:ind w:left="360"/>
+      </w:pPr>
+      <w:r>
+        <w:drawing>
+          <wp:inline distT="0" distB="0" distL="0" distR="0" wp14:anchorId="6280D88C" wp14:editId="0AD90A44">
+            <wp:extent cx="5943600" cy="1094105"/>
+            <wp:effectExtent l="0" t="0" r="0" b="0"/>
+            <wp:docPr id="1088988300" name="Picture 1"/>
+            <wp:cNvGraphicFramePr>
+              <a:graphicFrameLocks xmlns:a="http://schemas.openxmlformats.org/drawingml/2006/main" noChangeAspect="1"/>
+            </wp:cNvGraphicFramePr>
+            <a:graphic xmlns:a="http://schemas.openxmlformats.org/drawingml/2006/main">
+              <a:graphicData uri="http://schemas.openxmlformats.org/drawingml/2006/picture">
+                <pic:pic xmlns:pic="http://schemas.openxmlformats.org/drawingml/2006/picture">
+                  <pic:nvPicPr>
+                    <pic:cNvPr id="1088988300" name=""/>
+                    <pic:cNvPicPr/>
+                  </pic:nvPicPr>
+                  <pic:blipFill>
+                    <a:blip r:embed="rId12"/>
+                    <a:stretch>
+                      <a:fillRect/>
+                    </a:stretch>
+                  </pic:blipFill>
+                  <pic:spPr>
+                    <a:xfrm>
+                      <a:off x="0" y="0"/>
+                      <a:ext cx="5943600" cy="1094105"/>
+                    </a:xfrm>
+                    <a:prstGeom prst="rect">
+                      <a:avLst/>
+                    </a:prstGeom>
+                  </pic:spPr>
+                </pic:pic>
+              </a:graphicData>
+            </a:graphic>
+          </wp:inline>
+        </w:drawing>
+      </w:r>
+    </w:p>
+    <w:p>
+      <w:pPr>
+        <w:pStyle w:val="ListParagraph"/>
+        <w:ind w:left="360"/>
+      </w:pPr>
     </w:p>
     <w:p>
       <w:pPr>
@@ -241,8 +688,105 @@
         <w:ind w:left="360"/>
       </w:pPr>
       <w:r>
-        <w:t>Provide a screenshot of your Terminal window to show that your code ran correctly and successfully connected to localhost:5000.</w:t>
-      </w:r>
+        <w:t xml:space="preserve">Provide a screenshot to show that you correctly defined the </w:t>
+      </w:r>
+      <w:proofErr w:type="spellStart"/>
+      <w:r>
+        <w:t>admin_required</w:t>
+      </w:r>
+      <w:proofErr w:type="spellEnd"/>
+      <w:r>
+        <w:t>(</w:t>
+      </w:r>
+      <w:proofErr w:type="spellStart"/>
+      <w:r>
+        <w:t>fn</w:t>
+      </w:r>
+      <w:proofErr w:type="spellEnd"/>
+      <w:r>
+        <w:t>) function.</w:t>
+      </w:r>
+    </w:p>
+    <w:p>
+      <w:pPr>
+        <w:pStyle w:val="ListParagraph"/>
+        <w:ind w:left="360"/>
+      </w:pPr>
+    </w:p>
+    <w:p>
+      <w:pPr>
+        <w:pStyle w:val="ListParagraph"/>
+        <w:numPr>
+          <w:ilvl w:val="0"/>
+          <w:numId w:val="2"/>
+        </w:numPr>
+      </w:pPr>
+      <w:proofErr w:type="spellStart"/>
+      <w:r>
+        <w:t>admin_</w:t>
+      </w:r>
+      <w:proofErr w:type="gramStart"/>
+      <w:r>
+        <w:t>required</w:t>
+      </w:r>
+      <w:proofErr w:type="spellEnd"/>
+      <w:r>
+        <w:t>(</w:t>
+      </w:r>
+      <w:proofErr w:type="gramEnd"/>
+      <w:r>
+        <w:t>) function</w:t>
+      </w:r>
+    </w:p>
+    <w:p>
+      <w:pPr>
+        <w:pStyle w:val="ListParagraph"/>
+        <w:ind w:left="360"/>
+      </w:pPr>
+      <w:r>
+        <w:lastRenderedPageBreak/>
+        <w:drawing>
+          <wp:inline distT="0" distB="0" distL="0" distR="0" wp14:anchorId="77F14281" wp14:editId="33D9BD1F">
+            <wp:extent cx="5943600" cy="2775585"/>
+            <wp:effectExtent l="0" t="0" r="0" b="5715"/>
+            <wp:docPr id="811958260" name="Picture 1"/>
+            <wp:cNvGraphicFramePr>
+              <a:graphicFrameLocks xmlns:a="http://schemas.openxmlformats.org/drawingml/2006/main" noChangeAspect="1"/>
+            </wp:cNvGraphicFramePr>
+            <a:graphic xmlns:a="http://schemas.openxmlformats.org/drawingml/2006/main">
+              <a:graphicData uri="http://schemas.openxmlformats.org/drawingml/2006/picture">
+                <pic:pic xmlns:pic="http://schemas.openxmlformats.org/drawingml/2006/picture">
+                  <pic:nvPicPr>
+                    <pic:cNvPr id="811958260" name=""/>
+                    <pic:cNvPicPr/>
+                  </pic:nvPicPr>
+                  <pic:blipFill>
+                    <a:blip r:embed="rId13"/>
+                    <a:stretch>
+                      <a:fillRect/>
+                    </a:stretch>
+                  </pic:blipFill>
+                  <pic:spPr>
+                    <a:xfrm>
+                      <a:off x="0" y="0"/>
+                      <a:ext cx="5943600" cy="2775585"/>
+                    </a:xfrm>
+                    <a:prstGeom prst="rect">
+                      <a:avLst/>
+                    </a:prstGeom>
+                  </pic:spPr>
+                </pic:pic>
+              </a:graphicData>
+            </a:graphic>
+          </wp:inline>
+        </w:drawing>
+      </w:r>
+    </w:p>
+    <w:p>
+      <w:pPr>
+        <w:pStyle w:val="ListParagraph"/>
+        <w:ind w:left="360"/>
+      </w:pPr>
     </w:p>
     <w:p>
       <w:pPr>
@@ -254,8 +798,81 @@
         <w:ind w:left="360"/>
       </w:pPr>
       <w:r>
-        <w:t>Provide a screenshot of your browser window to show that you correctly opened the page localhost:5000/.</w:t>
-      </w:r>
+        <w:t>Provide a screenshot of your Terminal window to show that your code ran correctly and successfully connected to localhost:5000.</w:t>
+      </w:r>
+    </w:p>
+    <w:p>
+      <w:pPr>
+        <w:pStyle w:val="ListParagraph"/>
+        <w:ind w:left="360"/>
+      </w:pPr>
+    </w:p>
+    <w:p>
+      <w:pPr>
+        <w:pStyle w:val="ListParagraph"/>
+        <w:numPr>
+          <w:ilvl w:val="0"/>
+          <w:numId w:val="2"/>
+        </w:numPr>
+      </w:pPr>
+      <w:r>
+        <w:t>Localhost terminal running</w:t>
+      </w:r>
+    </w:p>
+    <w:p>
+      <w:pPr>
+        <w:pStyle w:val="ListParagraph"/>
+        <w:ind w:left="360"/>
+      </w:pPr>
+      <w:r>
+        <w:drawing>
+          <wp:inline distT="0" distB="0" distL="0" distR="0" wp14:anchorId="5770C91A" wp14:editId="61C12224">
+            <wp:extent cx="5943600" cy="1656715"/>
+            <wp:effectExtent l="0" t="0" r="0" b="635"/>
+            <wp:docPr id="176188187" name="Picture 1"/>
+            <wp:cNvGraphicFramePr>
+              <a:graphicFrameLocks xmlns:a="http://schemas.openxmlformats.org/drawingml/2006/main" noChangeAspect="1"/>
+            </wp:cNvGraphicFramePr>
+            <a:graphic xmlns:a="http://schemas.openxmlformats.org/drawingml/2006/main">
+              <a:graphicData uri="http://schemas.openxmlformats.org/drawingml/2006/picture">
+                <pic:pic xmlns:pic="http://schemas.openxmlformats.org/drawingml/2006/picture">
+                  <pic:nvPicPr>
+                    <pic:cNvPr id="176188187" name=""/>
+                    <pic:cNvPicPr/>
+                  </pic:nvPicPr>
+                  <pic:blipFill>
+                    <a:blip r:embed="rId14"/>
+                    <a:stretch>
+                      <a:fillRect/>
+                    </a:stretch>
+                  </pic:blipFill>
+                  <pic:spPr>
+                    <a:xfrm>
+                      <a:off x="0" y="0"/>
+                      <a:ext cx="5943600" cy="1656715"/>
+                    </a:xfrm>
+                    <a:prstGeom prst="rect">
+                      <a:avLst/>
+                    </a:prstGeom>
+                  </pic:spPr>
+                </pic:pic>
+              </a:graphicData>
+            </a:graphic>
+          </wp:inline>
+        </w:drawing>
+      </w:r>
+    </w:p>
+    <w:p>
+      <w:pPr>
+        <w:pStyle w:val="ListParagraph"/>
+        <w:ind w:left="360"/>
+      </w:pPr>
+    </w:p>
+    <w:p>
+      <w:pPr>
+        <w:pStyle w:val="ListParagraph"/>
+        <w:ind w:left="360"/>
+      </w:pPr>
     </w:p>
     <w:p>
       <w:pPr>
@@ -267,7 +884,60 @@
         <w:ind w:left="360"/>
       </w:pPr>
       <w:r>
-        <w:t>Provide a screenshot to show that you successfully logged in as an admin.</w:t>
+        <w:t>Provide a screenshot of your browser window to show that you correctly opened the page localhost:5000/.</w:t>
+      </w:r>
+    </w:p>
+    <w:p>
+      <w:pPr>
+        <w:pStyle w:val="ListParagraph"/>
+        <w:ind w:left="360"/>
+      </w:pPr>
+    </w:p>
+    <w:p>
+      <w:pPr>
+        <w:pStyle w:val="ListParagraph"/>
+        <w:ind w:left="360"/>
+      </w:pPr>
+      <w:r>
+        <w:lastRenderedPageBreak/>
+        <w:t>Localhost homepage</w:t>
+      </w:r>
+      <w:r>
+        <w:drawing>
+          <wp:inline distT="0" distB="0" distL="0" distR="0" wp14:anchorId="27FE0298" wp14:editId="22962819">
+            <wp:extent cx="5943600" cy="2151380"/>
+            <wp:effectExtent l="0" t="0" r="0" b="1270"/>
+            <wp:docPr id="1308444799" name="Picture 1"/>
+            <wp:cNvGraphicFramePr>
+              <a:graphicFrameLocks xmlns:a="http://schemas.openxmlformats.org/drawingml/2006/main" noChangeAspect="1"/>
+            </wp:cNvGraphicFramePr>
+            <a:graphic xmlns:a="http://schemas.openxmlformats.org/drawingml/2006/main">
+              <a:graphicData uri="http://schemas.openxmlformats.org/drawingml/2006/picture">
+                <pic:pic xmlns:pic="http://schemas.openxmlformats.org/drawingml/2006/picture">
+                  <pic:nvPicPr>
+                    <pic:cNvPr id="1308444799" name=""/>
+                    <pic:cNvPicPr/>
+                  </pic:nvPicPr>
+                  <pic:blipFill>
+                    <a:blip r:embed="rId15"/>
+                    <a:stretch>
+                      <a:fillRect/>
+                    </a:stretch>
+                  </pic:blipFill>
+                  <pic:spPr>
+                    <a:xfrm>
+                      <a:off x="0" y="0"/>
+                      <a:ext cx="5943600" cy="2151380"/>
+                    </a:xfrm>
+                    <a:prstGeom prst="rect">
+                      <a:avLst/>
+                    </a:prstGeom>
+                  </pic:spPr>
+                </pic:pic>
+              </a:graphicData>
+            </a:graphic>
+          </wp:inline>
+        </w:drawing>
       </w:r>
     </w:p>
     <w:p>
@@ -280,9 +950,80 @@
         <w:ind w:left="360"/>
       </w:pPr>
       <w:r>
-        <w:lastRenderedPageBreak/>
-        <w:t>Provide a screenshot to show that you can successfully see all the books defined in the app.py file along with their correct cover images in the “Books” tab.</w:t>
-      </w:r>
+        <w:t>Provide a screenshot to show that you successfully logged in as an admin.</w:t>
+      </w:r>
+    </w:p>
+    <w:p>
+      <w:pPr>
+        <w:spacing w:after="0" w:line="300" w:lineRule="atLeast"/>
+        <w:ind w:firstLine="360"/>
+        <w:rPr>
+          <w:rFonts w:ascii="Segoe UI" w:eastAsia="Times New Roman" w:hAnsi="Segoe UI" w:cs="Segoe UI"/>
+          <w:kern w:val="0"/>
+          <w:sz w:val="21"/>
+          <w:szCs w:val="21"/>
+          <w14:ligatures w14:val="none"/>
+        </w:rPr>
+      </w:pPr>
+      <w:r>
+        <w:rPr>
+          <w:rFonts w:ascii="Segoe UI" w:eastAsia="Times New Roman" w:hAnsi="Segoe UI" w:cs="Segoe UI"/>
+          <w:kern w:val="0"/>
+          <w:sz w:val="21"/>
+          <w:szCs w:val="21"/>
+          <w14:ligatures w14:val="none"/>
+        </w:rPr>
+        <w:t>Admin login</w:t>
+      </w:r>
+    </w:p>
+    <w:p>
+      <w:pPr>
+        <w:pStyle w:val="ListParagraph"/>
+        <w:ind w:left="360"/>
+      </w:pPr>
+      <w:r>
+        <w:drawing>
+          <wp:inline distT="0" distB="0" distL="0" distR="0" wp14:anchorId="4748279B" wp14:editId="7C7A22A6">
+            <wp:extent cx="4031311" cy="1674545"/>
+            <wp:effectExtent l="0" t="0" r="7620" b="1905"/>
+            <wp:docPr id="951520088" name="Picture 1"/>
+            <wp:cNvGraphicFramePr>
+              <a:graphicFrameLocks xmlns:a="http://schemas.openxmlformats.org/drawingml/2006/main" noChangeAspect="1"/>
+            </wp:cNvGraphicFramePr>
+            <a:graphic xmlns:a="http://schemas.openxmlformats.org/drawingml/2006/main">
+              <a:graphicData uri="http://schemas.openxmlformats.org/drawingml/2006/picture">
+                <pic:pic xmlns:pic="http://schemas.openxmlformats.org/drawingml/2006/picture">
+                  <pic:nvPicPr>
+                    <pic:cNvPr id="951520088" name=""/>
+                    <pic:cNvPicPr/>
+                  </pic:nvPicPr>
+                  <pic:blipFill>
+                    <a:blip r:embed="rId16"/>
+                    <a:stretch>
+                      <a:fillRect/>
+                    </a:stretch>
+                  </pic:blipFill>
+                  <pic:spPr>
+                    <a:xfrm>
+                      <a:off x="0" y="0"/>
+                      <a:ext cx="4060376" cy="1686618"/>
+                    </a:xfrm>
+                    <a:prstGeom prst="rect">
+                      <a:avLst/>
+                    </a:prstGeom>
+                  </pic:spPr>
+                </pic:pic>
+              </a:graphicData>
+            </a:graphic>
+          </wp:inline>
+        </w:drawing>
+      </w:r>
+    </w:p>
+    <w:p>
+      <w:pPr>
+        <w:pStyle w:val="ListParagraph"/>
+        <w:ind w:left="360"/>
+      </w:pPr>
     </w:p>
     <w:p>
       <w:pPr>
@@ -294,8 +1035,91 @@
         <w:ind w:left="360"/>
       </w:pPr>
       <w:r>
-        <w:t>Provide a screenshot to show that you can add a book using the “Add Books” tab.</w:t>
-      </w:r>
+        <w:t>Provide a screenshot to show that you can successfully see all the books defined in the app.py file along with their correct cover images in the “Books” tab.</w:t>
+      </w:r>
+    </w:p>
+    <w:p>
+      <w:pPr>
+        <w:pStyle w:val="ListParagraph"/>
+        <w:numPr>
+          <w:ilvl w:val="0"/>
+          <w:numId w:val="2"/>
+        </w:numPr>
+        <w:spacing w:after="0" w:line="300" w:lineRule="atLeast"/>
+        <w:rPr>
+          <w:rFonts w:ascii="Segoe UI" w:eastAsia="Times New Roman" w:hAnsi="Segoe UI" w:cs="Segoe UI"/>
+          <w:kern w:val="0"/>
+          <w:sz w:val="21"/>
+          <w:szCs w:val="21"/>
+          <w14:ligatures w14:val="none"/>
+        </w:rPr>
+      </w:pPr>
+      <w:r>
+        <w:rPr>
+          <w:rFonts w:ascii="Segoe UI" w:eastAsia="Times New Roman" w:hAnsi="Segoe UI" w:cs="Segoe UI"/>
+          <w:kern w:val="0"/>
+          <w:sz w:val="21"/>
+          <w:szCs w:val="21"/>
+          <w14:ligatures w14:val="none"/>
+        </w:rPr>
+        <w:t>Books page with images</w:t>
+      </w:r>
+    </w:p>
+    <w:p>
+      <w:pPr>
+        <w:pStyle w:val="ListParagraph"/>
+        <w:ind w:left="360"/>
+      </w:pPr>
+    </w:p>
+    <w:p>
+      <w:pPr>
+        <w:pStyle w:val="ListParagraph"/>
+        <w:ind w:left="360"/>
+      </w:pPr>
+      <w:r>
+        <w:lastRenderedPageBreak/>
+        <w:drawing>
+          <wp:inline distT="0" distB="0" distL="0" distR="0" wp14:anchorId="2E9374F0" wp14:editId="558AEC93">
+            <wp:extent cx="1979875" cy="3240204"/>
+            <wp:effectExtent l="0" t="0" r="1905" b="0"/>
+            <wp:docPr id="358510648" name="Picture 1"/>
+            <wp:cNvGraphicFramePr>
+              <a:graphicFrameLocks xmlns:a="http://schemas.openxmlformats.org/drawingml/2006/main" noChangeAspect="1"/>
+            </wp:cNvGraphicFramePr>
+            <a:graphic xmlns:a="http://schemas.openxmlformats.org/drawingml/2006/main">
+              <a:graphicData uri="http://schemas.openxmlformats.org/drawingml/2006/picture">
+                <pic:pic xmlns:pic="http://schemas.openxmlformats.org/drawingml/2006/picture">
+                  <pic:nvPicPr>
+                    <pic:cNvPr id="358510648" name=""/>
+                    <pic:cNvPicPr/>
+                  </pic:nvPicPr>
+                  <pic:blipFill>
+                    <a:blip r:embed="rId17"/>
+                    <a:stretch>
+                      <a:fillRect/>
+                    </a:stretch>
+                  </pic:blipFill>
+                  <pic:spPr>
+                    <a:xfrm>
+                      <a:off x="0" y="0"/>
+                      <a:ext cx="1995918" cy="3266459"/>
+                    </a:xfrm>
+                    <a:prstGeom prst="rect">
+                      <a:avLst/>
+                    </a:prstGeom>
+                  </pic:spPr>
+                </pic:pic>
+              </a:graphicData>
+            </a:graphic>
+          </wp:inline>
+        </w:drawing>
+      </w:r>
+    </w:p>
+    <w:p>
+      <w:pPr>
+        <w:pStyle w:val="ListParagraph"/>
+        <w:ind w:left="360"/>
+      </w:pPr>
     </w:p>
     <w:p>
       <w:pPr>
@@ -307,8 +1131,121 @@
         <w:ind w:left="360"/>
       </w:pPr>
       <w:r>
-        <w:t>Provide a screenshot to show that you successfully logged in as a reader.</w:t>
-      </w:r>
+        <w:t>Provide a screenshot to show that you can add a book using the “Add Books” tab.</w:t>
+      </w:r>
+    </w:p>
+    <w:p>
+      <w:pPr>
+        <w:pStyle w:val="ListParagraph"/>
+        <w:ind w:left="360"/>
+      </w:pPr>
+    </w:p>
+    <w:p>
+      <w:pPr>
+        <w:pStyle w:val="ListParagraph"/>
+        <w:ind w:left="360"/>
+      </w:pPr>
+      <w:r>
+        <w:lastRenderedPageBreak/>
+        <w:t>Add book as admin</w:t>
+      </w:r>
+      <w:r>
+        <w:drawing>
+          <wp:inline distT="0" distB="0" distL="0" distR="0" wp14:anchorId="24298BB8" wp14:editId="0C491D55">
+            <wp:extent cx="4694805" cy="5820355"/>
+            <wp:effectExtent l="0" t="0" r="0" b="9525"/>
+            <wp:docPr id="1359688713" name="Picture 1"/>
+            <wp:cNvGraphicFramePr>
+              <a:graphicFrameLocks xmlns:a="http://schemas.openxmlformats.org/drawingml/2006/main" noChangeAspect="1"/>
+            </wp:cNvGraphicFramePr>
+            <a:graphic xmlns:a="http://schemas.openxmlformats.org/drawingml/2006/main">
+              <a:graphicData uri="http://schemas.openxmlformats.org/drawingml/2006/picture">
+                <pic:pic xmlns:pic="http://schemas.openxmlformats.org/drawingml/2006/picture">
+                  <pic:nvPicPr>
+                    <pic:cNvPr id="1359688713" name=""/>
+                    <pic:cNvPicPr/>
+                  </pic:nvPicPr>
+                  <pic:blipFill>
+                    <a:blip r:embed="rId18"/>
+                    <a:stretch>
+                      <a:fillRect/>
+                    </a:stretch>
+                  </pic:blipFill>
+                  <pic:spPr>
+                    <a:xfrm>
+                      <a:off x="0" y="0"/>
+                      <a:ext cx="4699004" cy="5825561"/>
+                    </a:xfrm>
+                    <a:prstGeom prst="rect">
+                      <a:avLst/>
+                    </a:prstGeom>
+                  </pic:spPr>
+                </pic:pic>
+              </a:graphicData>
+            </a:graphic>
+          </wp:inline>
+        </w:drawing>
+      </w:r>
+    </w:p>
+    <w:p>
+      <w:pPr>
+        <w:pStyle w:val="ListParagraph"/>
+        <w:ind w:left="360"/>
+      </w:pPr>
+    </w:p>
+    <w:p>
+      <w:pPr>
+        <w:pStyle w:val="ListParagraph"/>
+        <w:ind w:left="360"/>
+      </w:pPr>
+    </w:p>
+    <w:p>
+      <w:pPr>
+        <w:pStyle w:val="ListParagraph"/>
+        <w:ind w:left="360"/>
+      </w:pPr>
+    </w:p>
+    <w:p>
+      <w:pPr>
+        <w:pStyle w:val="ListParagraph"/>
+        <w:ind w:left="360"/>
+      </w:pPr>
+    </w:p>
+    <w:p>
+      <w:pPr>
+        <w:pStyle w:val="ListParagraph"/>
+        <w:ind w:left="360"/>
+      </w:pPr>
+    </w:p>
+    <w:p>
+      <w:pPr>
+        <w:pStyle w:val="ListParagraph"/>
+        <w:ind w:left="360"/>
+      </w:pPr>
+    </w:p>
+    <w:p>
+      <w:pPr>
+        <w:pStyle w:val="ListParagraph"/>
+        <w:ind w:left="360"/>
+      </w:pPr>
+    </w:p>
+    <w:p>
+      <w:pPr>
+        <w:pStyle w:val="ListParagraph"/>
+        <w:ind w:left="360"/>
+      </w:pPr>
+    </w:p>
+    <w:p>
+      <w:pPr>
+        <w:pStyle w:val="ListParagraph"/>
+        <w:ind w:left="360"/>
+      </w:pPr>
+    </w:p>
+    <w:p>
+      <w:pPr>
+        <w:pStyle w:val="ListParagraph"/>
+        <w:ind w:left="360"/>
+      </w:pPr>
     </w:p>
     <w:p>
       <w:pPr>
@@ -320,10 +1257,146 @@
         <w:ind w:left="360"/>
       </w:pPr>
       <w:r>
+        <w:t>Provide a screenshot to show that you successfully logged in as a reader.</w:t>
+      </w:r>
+    </w:p>
+    <w:p>
+      <w:pPr>
+        <w:spacing w:after="0" w:line="300" w:lineRule="atLeast"/>
+        <w:rPr>
+          <w:rFonts w:ascii="Segoe UI" w:eastAsia="Times New Roman" w:hAnsi="Segoe UI" w:cs="Segoe UI"/>
+          <w:kern w:val="0"/>
+          <w:sz w:val="21"/>
+          <w:szCs w:val="21"/>
+          <w14:ligatures w14:val="none"/>
+        </w:rPr>
+      </w:pPr>
+      <w:r>
+        <w:rPr>
+          <w:rFonts w:ascii="Segoe UI" w:eastAsia="Times New Roman" w:hAnsi="Segoe UI" w:cs="Segoe UI"/>
+          <w:kern w:val="0"/>
+          <w:sz w:val="21"/>
+          <w:szCs w:val="21"/>
+          <w14:ligatures w14:val="none"/>
+        </w:rPr>
+        <w:lastRenderedPageBreak/>
+        <w:t>Reader login</w:t>
+      </w:r>
+    </w:p>
+    <w:p>
+      <w:r>
+        <w:drawing>
+          <wp:inline distT="0" distB="0" distL="0" distR="0" wp14:anchorId="5EB040EB" wp14:editId="7E3259C8">
+            <wp:extent cx="4492487" cy="2090254"/>
+            <wp:effectExtent l="0" t="0" r="3810" b="5715"/>
+            <wp:docPr id="58350592" name="Picture 1"/>
+            <wp:cNvGraphicFramePr>
+              <a:graphicFrameLocks xmlns:a="http://schemas.openxmlformats.org/drawingml/2006/main" noChangeAspect="1"/>
+            </wp:cNvGraphicFramePr>
+            <a:graphic xmlns:a="http://schemas.openxmlformats.org/drawingml/2006/main">
+              <a:graphicData uri="http://schemas.openxmlformats.org/drawingml/2006/picture">
+                <pic:pic xmlns:pic="http://schemas.openxmlformats.org/drawingml/2006/picture">
+                  <pic:nvPicPr>
+                    <pic:cNvPr id="58350592" name=""/>
+                    <pic:cNvPicPr/>
+                  </pic:nvPicPr>
+                  <pic:blipFill>
+                    <a:blip r:embed="rId19"/>
+                    <a:stretch>
+                      <a:fillRect/>
+                    </a:stretch>
+                  </pic:blipFill>
+                  <pic:spPr>
+                    <a:xfrm>
+                      <a:off x="0" y="0"/>
+                      <a:ext cx="4498470" cy="2093038"/>
+                    </a:xfrm>
+                    <a:prstGeom prst="rect">
+                      <a:avLst/>
+                    </a:prstGeom>
+                  </pic:spPr>
+                </pic:pic>
+              </a:graphicData>
+            </a:graphic>
+          </wp:inline>
+        </w:drawing>
+      </w:r>
+    </w:p>
+    <w:p/>
+    <w:p>
+      <w:pPr>
+        <w:pStyle w:val="ListParagraph"/>
+        <w:numPr>
+          <w:ilvl w:val="0"/>
+          <w:numId w:val="1"/>
+        </w:numPr>
+        <w:ind w:left="360"/>
+      </w:pPr>
+      <w:r>
         <w:t>Provide a screenshot of the error message to show that you can’t add a new book to your website using an account with only reader privileges.</w:t>
       </w:r>
     </w:p>
-    <w:p/>
+    <w:p>
+      <w:pPr>
+        <w:spacing w:after="0" w:line="300" w:lineRule="atLeast"/>
+        <w:rPr>
+          <w:rFonts w:ascii="Segoe UI" w:eastAsia="Times New Roman" w:hAnsi="Segoe UI" w:cs="Segoe UI"/>
+          <w:kern w:val="0"/>
+          <w:sz w:val="21"/>
+          <w:szCs w:val="21"/>
+          <w14:ligatures w14:val="none"/>
+        </w:rPr>
+      </w:pPr>
+      <w:r>
+        <w:rPr>
+          <w:rFonts w:ascii="Segoe UI" w:eastAsia="Times New Roman" w:hAnsi="Segoe UI" w:cs="Segoe UI"/>
+          <w:kern w:val="0"/>
+          <w:sz w:val="21"/>
+          <w:szCs w:val="21"/>
+          <w14:ligatures w14:val="none"/>
+        </w:rPr>
+        <w:t>Reader access denied</w:t>
+      </w:r>
+    </w:p>
+    <w:p>
+      <w:r>
+        <w:drawing>
+          <wp:inline distT="0" distB="0" distL="0" distR="0" wp14:anchorId="34978318" wp14:editId="72381D7C">
+            <wp:extent cx="5088835" cy="2248749"/>
+            <wp:effectExtent l="0" t="0" r="0" b="0"/>
+            <wp:docPr id="483236326" name="Picture 1"/>
+            <wp:cNvGraphicFramePr>
+              <a:graphicFrameLocks xmlns:a="http://schemas.openxmlformats.org/drawingml/2006/main" noChangeAspect="1"/>
+            </wp:cNvGraphicFramePr>
+            <a:graphic xmlns:a="http://schemas.openxmlformats.org/drawingml/2006/main">
+              <a:graphicData uri="http://schemas.openxmlformats.org/drawingml/2006/picture">
+                <pic:pic xmlns:pic="http://schemas.openxmlformats.org/drawingml/2006/picture">
+                  <pic:nvPicPr>
+                    <pic:cNvPr id="483236326" name=""/>
+                    <pic:cNvPicPr/>
+                  </pic:nvPicPr>
+                  <pic:blipFill>
+                    <a:blip r:embed="rId20"/>
+                    <a:stretch>
+                      <a:fillRect/>
+                    </a:stretch>
+                  </pic:blipFill>
+                  <pic:spPr>
+                    <a:xfrm>
+                      <a:off x="0" y="0"/>
+                      <a:ext cx="5098805" cy="2253155"/>
+                    </a:xfrm>
+                    <a:prstGeom prst="rect">
+                      <a:avLst/>
+                    </a:prstGeom>
+                  </pic:spPr>
+                </pic:pic>
+              </a:graphicData>
+            </a:graphic>
+          </wp:inline>
+        </w:drawing>
+      </w:r>
+    </w:p>
     <w:p/>
     <w:sectPr>
       <w:pgSz w:w="12240" w:h="15840"/>
@@ -338,6 +1411,119 @@
 <file path=word/numbering.xml><?xml version="1.0" encoding="utf-8"?>
 <w:numbering xmlns:wpc="http://schemas.microsoft.com/office/word/2010/wordprocessingCanvas" xmlns:cx="http://schemas.microsoft.com/office/drawing/2014/chartex" xmlns:cx1="http://schemas.microsoft.com/office/drawing/2015/9/8/chartex" xmlns:cx2="http://schemas.microsoft.com/office/drawing/2015/10/21/chartex" xmlns:cx3="http://schemas.microsoft.com/office/drawing/2016/5/9/chartex" xmlns:cx4="http://schemas.microsoft.com/office/drawing/2016/5/10/chartex" xmlns:cx5="http://schemas.microsoft.com/office/drawing/2016/5/11/chartex" xmlns:cx6="http://schemas.microsoft.com/office/drawing/2016/5/12/chartex" xmlns:cx7="http://schemas.microsoft.com/office/drawing/2016/5/13/chartex" xmlns:cx8="http://schemas.microsoft.com/office/drawing/2016/5/14/chartex" xmlns:mc="http://schemas.openxmlformats.org/markup-compatibility/2006" xmlns:aink="http://schemas.microsoft.com/office/drawing/2016/ink" xmlns:am3d="http://schemas.microsoft.com/office/drawing/2017/model3d" xmlns:o="urn:schemas-microsoft-com:office:office" xmlns:oel="http://schemas.microsoft.com/office/2019/extlst" xmlns:r="http://schemas.openxmlformats.org/officeDocument/2006/relationships" xmlns:m="http://schemas.openxmlformats.org/officeDocument/2006/math" xmlns:v="urn:schemas-microsoft-com:vml" xmlns:wp14="http://schemas.microsoft.com/office/word/2010/wordprocessingDrawing" xmlns:wp="http://schemas.openxmlformats.org/drawingml/2006/wordprocessingDrawing" xmlns:w10="urn:schemas-microsoft-com:office:word" xmlns:w="http://schemas.openxmlformats.org/wordprocessingml/2006/main" xmlns:w14="http://schemas.microsoft.com/office/word/2010/wordml" xmlns:w15="http://schemas.microsoft.com/office/word/2012/wordml" xmlns:w16cex="http://schemas.microsoft.com/office/word/2018/wordml/cex" xmlns:w16cid="http://schemas.microsoft.com/office/word/2016/wordml/cid" xmlns:w16="http://schemas.microsoft.com/office/word/2018/wordml" xmlns:w16du="http://schemas.microsoft.com/office/word/2023/wordml/word16du" xmlns:w16sdtdh="http://schemas.microsoft.com/office/word/2020/wordml/sdtdatahash" xmlns:w16sdtfl="http://schemas.microsoft.com/office/word/2024/wordml/sdtformatlock" xmlns:w16se="http://schemas.microsoft.com/office/word/2015/wordml/symex" xmlns:wpg="http://schemas.microsoft.com/office/word/2010/wordprocessingGroup" xmlns:wpi="http://schemas.microsoft.com/office/word/2010/wordprocessingInk" xmlns:wne="http://schemas.microsoft.com/office/word/2006/wordml" xmlns:wps="http://schemas.microsoft.com/office/word/2010/wordprocessingShape" mc:Ignorable="w14 w15 w16se w16cid w16 w16cex w16sdtdh w16sdtfl w16du wp14">
   <w:abstractNum w:abstractNumId="0" w15:restartNumberingAfterBreak="0">
+    <w:nsid w:val="22152B77"/>
+    <w:multiLevelType w:val="hybridMultilevel"/>
+    <w:tmpl w:val="EAEC1B64"/>
+    <w:lvl w:ilvl="0" w:tplc="CDA6E796">
+      <w:start w:val="2"/>
+      <w:numFmt w:val="bullet"/>
+      <w:lvlText w:val="-"/>
+      <w:lvlJc w:val="left"/>
+      <w:pPr>
+        <w:ind w:left="1080" w:hanging="360"/>
+      </w:pPr>
+      <w:rPr>
+        <w:rFonts w:ascii="Segoe UI" w:eastAsia="Times New Roman" w:hAnsi="Segoe UI" w:cs="Segoe UI" w:hint="default"/>
+      </w:rPr>
+    </w:lvl>
+    <w:lvl w:ilvl="1" w:tplc="04090003" w:tentative="1">
+      <w:start w:val="1"/>
+      <w:numFmt w:val="bullet"/>
+      <w:lvlText w:val="o"/>
+      <w:lvlJc w:val="left"/>
+      <w:pPr>
+        <w:ind w:left="1800" w:hanging="360"/>
+      </w:pPr>
+      <w:rPr>
+        <w:rFonts w:ascii="Courier New" w:hAnsi="Courier New" w:cs="Courier New" w:hint="default"/>
+      </w:rPr>
+    </w:lvl>
+    <w:lvl w:ilvl="2" w:tplc="04090005" w:tentative="1">
+      <w:start w:val="1"/>
+      <w:numFmt w:val="bullet"/>
+      <w:lvlText w:val=""/>
+      <w:lvlJc w:val="left"/>
+      <w:pPr>
+        <w:ind w:left="2520" w:hanging="360"/>
+      </w:pPr>
+      <w:rPr>
+        <w:rFonts w:ascii="Wingdings" w:hAnsi="Wingdings" w:hint="default"/>
+      </w:rPr>
+    </w:lvl>
+    <w:lvl w:ilvl="3" w:tplc="04090001" w:tentative="1">
+      <w:start w:val="1"/>
+      <w:numFmt w:val="bullet"/>
+      <w:lvlText w:val=""/>
+      <w:lvlJc w:val="left"/>
+      <w:pPr>
+        <w:ind w:left="3240" w:hanging="360"/>
+      </w:pPr>
+      <w:rPr>
+        <w:rFonts w:ascii="Symbol" w:hAnsi="Symbol" w:hint="default"/>
+      </w:rPr>
+    </w:lvl>
+    <w:lvl w:ilvl="4" w:tplc="04090003" w:tentative="1">
+      <w:start w:val="1"/>
+      <w:numFmt w:val="bullet"/>
+      <w:lvlText w:val="o"/>
+      <w:lvlJc w:val="left"/>
+      <w:pPr>
+        <w:ind w:left="3960" w:hanging="360"/>
+      </w:pPr>
+      <w:rPr>
+        <w:rFonts w:ascii="Courier New" w:hAnsi="Courier New" w:cs="Courier New" w:hint="default"/>
+      </w:rPr>
+    </w:lvl>
+    <w:lvl w:ilvl="5" w:tplc="04090005" w:tentative="1">
+      <w:start w:val="1"/>
+      <w:numFmt w:val="bullet"/>
+      <w:lvlText w:val=""/>
+      <w:lvlJc w:val="left"/>
+      <w:pPr>
+        <w:ind w:left="4680" w:hanging="360"/>
+      </w:pPr>
+      <w:rPr>
+        <w:rFonts w:ascii="Wingdings" w:hAnsi="Wingdings" w:hint="default"/>
+      </w:rPr>
+    </w:lvl>
+    <w:lvl w:ilvl="6" w:tplc="04090001" w:tentative="1">
+      <w:start w:val="1"/>
+      <w:numFmt w:val="bullet"/>
+      <w:lvlText w:val=""/>
+      <w:lvlJc w:val="left"/>
+      <w:pPr>
+        <w:ind w:left="5400" w:hanging="360"/>
+      </w:pPr>
+      <w:rPr>
+        <w:rFonts w:ascii="Symbol" w:hAnsi="Symbol" w:hint="default"/>
+      </w:rPr>
+    </w:lvl>
+    <w:lvl w:ilvl="7" w:tplc="04090003" w:tentative="1">
+      <w:start w:val="1"/>
+      <w:numFmt w:val="bullet"/>
+      <w:lvlText w:val="o"/>
+      <w:lvlJc w:val="left"/>
+      <w:pPr>
+        <w:ind w:left="6120" w:hanging="360"/>
+      </w:pPr>
+      <w:rPr>
+        <w:rFonts w:ascii="Courier New" w:hAnsi="Courier New" w:cs="Courier New" w:hint="default"/>
+      </w:rPr>
+    </w:lvl>
+    <w:lvl w:ilvl="8" w:tplc="04090005" w:tentative="1">
+      <w:start w:val="1"/>
+      <w:numFmt w:val="bullet"/>
+      <w:lvlText w:val=""/>
+      <w:lvlJc w:val="left"/>
+      <w:pPr>
+        <w:ind w:left="6840" w:hanging="360"/>
+      </w:pPr>
+      <w:rPr>
+        <w:rFonts w:ascii="Wingdings" w:hAnsi="Wingdings" w:hint="default"/>
+      </w:rPr>
+    </w:lvl>
+  </w:abstractNum>
+  <w:abstractNum w:abstractNumId="1" w15:restartNumberingAfterBreak="0">
     <w:nsid w:val="69470666"/>
     <w:multiLevelType w:val="hybridMultilevel"/>
     <w:tmpl w:val="5EEE410C"/>
@@ -424,6 +1610,9 @@
     </w:lvl>
   </w:abstractNum>
   <w:num w:numId="1" w16cid:durableId="2005862539">
+    <w:abstractNumId w:val="1"/>
+  </w:num>
+  <w:num w:numId="2" w16cid:durableId="1240746254">
     <w:abstractNumId w:val="0"/>
   </w:num>
 </w:numbering>
@@ -1346,6 +2535,19 @@
       <w:spacing w:val="5"/>
     </w:rPr>
   </w:style>
+  <w:style w:type="character" w:styleId="HTMLCode">
+    <w:name w:val="HTML Code"/>
+    <w:basedOn w:val="DefaultParagraphFont"/>
+    <w:uiPriority w:val="99"/>
+    <w:semiHidden/>
+    <w:unhideWhenUsed/>
+    <w:rsid w:val="00E34493"/>
+    <w:rPr>
+      <w:rFonts w:ascii="Courier New" w:eastAsia="Times New Roman" w:hAnsi="Courier New" w:cs="Courier New"/>
+      <w:sz w:val="20"/>
+      <w:szCs w:val="20"/>
+    </w:rPr>
+  </w:style>
 </w:styles>
 </file>
 

</xml_diff>